<commit_message>
docs: atualiza dicionário e modelo lógico e adiciona a correção recebida
</commit_message>
<xml_diff>
--- a/fitnutri-db/docs/modelo-logico.docx
+++ b/fitnutri-db/docs/modelo-logico.docx
@@ -4,7 +4,7 @@
   <w:body>
     <w:p>
       <w:pPr>
-        <w:shd w:fill="ececec" w:val="clear"/>
+        <w:shd w:fill="ffffff" w:val="clear"/>
         <w:rPr>
           <w:sz w:val="18"/>
           <w:szCs w:val="18"/>
@@ -38,7 +38,7 @@
     </w:p>
     <w:p>
       <w:pPr>
-        <w:shd w:fill="ececec" w:val="clear"/>
+        <w:shd w:fill="ffffff" w:val="clear"/>
         <w:rPr>
           <w:sz w:val="18"/>
           <w:szCs w:val="18"/>
@@ -72,18 +72,16 @@
     </w:p>
     <w:p>
       <w:pPr>
-        <w:shd w:fill="ececec" w:val="clear"/>
-        <w:rPr>
-          <w:sz w:val="18"/>
-          <w:szCs w:val="18"/>
-          <w:shd w:fill="6aa84f" w:val="clear"/>
-        </w:rPr>
-      </w:pPr>
-      <w:r>
-        <w:rPr>
-          <w:sz w:val="18"/>
-          <w:szCs w:val="18"/>
-          <w:shd w:fill="6aa84f" w:val="clear"/>
+        <w:shd w:fill="ffffff" w:val="clear"/>
+        <w:rPr>
+          <w:sz w:val="18"/>
+          <w:szCs w:val="18"/>
+        </w:rPr>
+      </w:pPr>
+      <w:r>
+        <w:rPr>
+          <w:sz w:val="18"/>
+          <w:szCs w:val="18"/>
           <w:rtl w:val="0"/>
         </w:rPr>
         <w:t xml:space="preserve">Contato_Emergencia(</w:t>
@@ -93,7 +91,6 @@
           <w:sz w:val="18"/>
           <w:szCs w:val="18"/>
           <w:u w:val="single"/>
-          <w:shd w:fill="6aa84f" w:val="clear"/>
           <w:rtl w:val="0"/>
         </w:rPr>
         <w:t xml:space="preserve">id_contato_emr, #id_paciente</w:t>
@@ -102,7 +99,6 @@
         <w:rPr>
           <w:sz w:val="18"/>
           <w:szCs w:val="18"/>
-          <w:shd w:fill="6aa84f" w:val="clear"/>
           <w:rtl w:val="0"/>
         </w:rPr>
         <w:t xml:space="preserve">, nome*, numero*)</w:t>
@@ -110,18 +106,16 @@
     </w:p>
     <w:p>
       <w:pPr>
-        <w:shd w:fill="ececec" w:val="clear"/>
-        <w:rPr>
-          <w:sz w:val="18"/>
-          <w:szCs w:val="18"/>
-          <w:shd w:fill="6aa84f" w:val="clear"/>
-        </w:rPr>
-      </w:pPr>
-      <w:r>
-        <w:rPr>
-          <w:sz w:val="18"/>
-          <w:szCs w:val="18"/>
-          <w:shd w:fill="6aa84f" w:val="clear"/>
+        <w:shd w:fill="ffffff" w:val="clear"/>
+        <w:rPr>
+          <w:sz w:val="18"/>
+          <w:szCs w:val="18"/>
+        </w:rPr>
+      </w:pPr>
+      <w:r>
+        <w:rPr>
+          <w:sz w:val="18"/>
+          <w:szCs w:val="18"/>
           <w:rtl w:val="0"/>
         </w:rPr>
         <w:t xml:space="preserve">Restricao_Fisica(</w:t>
@@ -131,7 +125,6 @@
           <w:sz w:val="18"/>
           <w:szCs w:val="18"/>
           <w:u w:val="single"/>
-          <w:shd w:fill="6aa84f" w:val="clear"/>
           <w:rtl w:val="0"/>
         </w:rPr>
         <w:t xml:space="preserve">id_restri_fisica, #id_paciente</w:t>
@@ -140,7 +133,6 @@
         <w:rPr>
           <w:sz w:val="18"/>
           <w:szCs w:val="18"/>
-          <w:shd w:fill="6aa84f" w:val="clear"/>
           <w:rtl w:val="0"/>
         </w:rPr>
         <w:t xml:space="preserve">, limitacoes_fisicas*)</w:t>
@@ -148,18 +140,16 @@
     </w:p>
     <w:p>
       <w:pPr>
-        <w:shd w:fill="ececec" w:val="clear"/>
-        <w:rPr>
-          <w:sz w:val="18"/>
-          <w:szCs w:val="18"/>
-          <w:shd w:fill="6aa84f" w:val="clear"/>
-        </w:rPr>
-      </w:pPr>
-      <w:r>
-        <w:rPr>
-          <w:sz w:val="18"/>
-          <w:szCs w:val="18"/>
-          <w:shd w:fill="6aa84f" w:val="clear"/>
+        <w:shd w:fill="ffffff" w:val="clear"/>
+        <w:rPr>
+          <w:sz w:val="18"/>
+          <w:szCs w:val="18"/>
+        </w:rPr>
+      </w:pPr>
+      <w:r>
+        <w:rPr>
+          <w:sz w:val="18"/>
+          <w:szCs w:val="18"/>
           <w:rtl w:val="0"/>
         </w:rPr>
         <w:t xml:space="preserve">Restricao_Alimentar(</w:t>
@@ -169,7 +159,6 @@
           <w:sz w:val="18"/>
           <w:szCs w:val="18"/>
           <w:u w:val="single"/>
-          <w:shd w:fill="6aa84f" w:val="clear"/>
           <w:rtl w:val="0"/>
         </w:rPr>
         <w:t xml:space="preserve">id_restri_alim, #id_paciente</w:t>
@@ -178,7 +167,6 @@
         <w:rPr>
           <w:sz w:val="18"/>
           <w:szCs w:val="18"/>
-          <w:shd w:fill="6aa84f" w:val="clear"/>
           <w:rtl w:val="0"/>
         </w:rPr>
         <w:t xml:space="preserve">, limitacoes_alimentares*)</w:t>
@@ -186,18 +174,16 @@
     </w:p>
     <w:p>
       <w:pPr>
-        <w:shd w:fill="ececec" w:val="clear"/>
-        <w:rPr>
-          <w:sz w:val="18"/>
-          <w:szCs w:val="18"/>
-          <w:shd w:fill="6aa84f" w:val="clear"/>
-        </w:rPr>
-      </w:pPr>
-      <w:r>
-        <w:rPr>
-          <w:sz w:val="18"/>
-          <w:szCs w:val="18"/>
-          <w:shd w:fill="6aa84f" w:val="clear"/>
+        <w:shd w:fill="ffffff" w:val="clear"/>
+        <w:rPr>
+          <w:sz w:val="18"/>
+          <w:szCs w:val="18"/>
+        </w:rPr>
+      </w:pPr>
+      <w:r>
+        <w:rPr>
+          <w:sz w:val="18"/>
+          <w:szCs w:val="18"/>
           <w:rtl w:val="0"/>
         </w:rPr>
         <w:t xml:space="preserve">Paciente_Doenca(</w:t>
@@ -207,7 +193,6 @@
           <w:sz w:val="18"/>
           <w:szCs w:val="18"/>
           <w:u w:val="single"/>
-          <w:shd w:fill="6aa84f" w:val="clear"/>
           <w:rtl w:val="0"/>
         </w:rPr>
         <w:t xml:space="preserve">id_paciente_doenca, #id_paciente</w:t>
@@ -216,7 +201,6 @@
         <w:rPr>
           <w:sz w:val="18"/>
           <w:szCs w:val="18"/>
-          <w:shd w:fill="6aa84f" w:val="clear"/>
           <w:rtl w:val="0"/>
         </w:rPr>
         <w:t xml:space="preserve">, doencas*)</w:t>
@@ -224,18 +208,16 @@
     </w:p>
     <w:p>
       <w:pPr>
-        <w:shd w:fill="ececec" w:val="clear"/>
-        <w:rPr>
-          <w:sz w:val="18"/>
-          <w:szCs w:val="18"/>
-          <w:shd w:fill="6aa84f" w:val="clear"/>
-        </w:rPr>
-      </w:pPr>
-      <w:r>
-        <w:rPr>
-          <w:sz w:val="18"/>
-          <w:szCs w:val="18"/>
-          <w:shd w:fill="6aa84f" w:val="clear"/>
+        <w:shd w:fill="ffffff" w:val="clear"/>
+        <w:rPr>
+          <w:sz w:val="18"/>
+          <w:szCs w:val="18"/>
+        </w:rPr>
+      </w:pPr>
+      <w:r>
+        <w:rPr>
+          <w:sz w:val="18"/>
+          <w:szCs w:val="18"/>
           <w:rtl w:val="0"/>
         </w:rPr>
         <w:t xml:space="preserve">Paciente_Alergia(</w:t>
@@ -245,7 +227,6 @@
           <w:sz w:val="18"/>
           <w:szCs w:val="18"/>
           <w:u w:val="single"/>
-          <w:shd w:fill="6aa84f" w:val="clear"/>
           <w:rtl w:val="0"/>
         </w:rPr>
         <w:t xml:space="preserve">id_paciente_alerg, #id_paciente,</w:t>
@@ -254,7 +235,6 @@
         <w:rPr>
           <w:sz w:val="18"/>
           <w:szCs w:val="18"/>
-          <w:shd w:fill="6aa84f" w:val="clear"/>
           <w:rtl w:val="0"/>
         </w:rPr>
         <w:t xml:space="preserve"> alergias*)</w:t>
@@ -262,18 +242,16 @@
     </w:p>
     <w:p>
       <w:pPr>
-        <w:shd w:fill="ececec" w:val="clear"/>
-        <w:rPr>
-          <w:sz w:val="18"/>
-          <w:szCs w:val="18"/>
-          <w:shd w:fill="6aa84f" w:val="clear"/>
-        </w:rPr>
-      </w:pPr>
-      <w:r>
-        <w:rPr>
-          <w:sz w:val="18"/>
-          <w:szCs w:val="18"/>
-          <w:shd w:fill="6aa84f" w:val="clear"/>
+        <w:shd w:fill="ffffff" w:val="clear"/>
+        <w:rPr>
+          <w:sz w:val="18"/>
+          <w:szCs w:val="18"/>
+        </w:rPr>
+      </w:pPr>
+      <w:r>
+        <w:rPr>
+          <w:sz w:val="18"/>
+          <w:szCs w:val="18"/>
           <w:rtl w:val="0"/>
         </w:rPr>
         <w:t xml:space="preserve">Medicamento(</w:t>
@@ -283,7 +261,6 @@
           <w:sz w:val="18"/>
           <w:szCs w:val="18"/>
           <w:u w:val="single"/>
-          <w:shd w:fill="6aa84f" w:val="clear"/>
           <w:rtl w:val="0"/>
         </w:rPr>
         <w:t xml:space="preserve">id_medicamento, #id_paciente</w:t>
@@ -292,7 +269,6 @@
         <w:rPr>
           <w:sz w:val="18"/>
           <w:szCs w:val="18"/>
-          <w:shd w:fill="6aa84f" w:val="clear"/>
           <w:rtl w:val="0"/>
         </w:rPr>
         <w:t xml:space="preserve">, medicamentos*)</w:t>
@@ -300,21 +276,21 @@
     </w:p>
     <w:p>
       <w:pPr>
-        <w:shd w:fill="ececec" w:val="clear"/>
-        <w:rPr>
-          <w:sz w:val="18"/>
-          <w:szCs w:val="18"/>
-        </w:rPr>
-      </w:pPr>
-      <w:r>
-        <w:rPr>
-          <w:rtl w:val="0"/>
-        </w:rPr>
-      </w:r>
-    </w:p>
-    <w:p>
-      <w:pPr>
-        <w:shd w:fill="ececec" w:val="clear"/>
+        <w:shd w:fill="ffffff" w:val="clear"/>
+        <w:rPr>
+          <w:sz w:val="18"/>
+          <w:szCs w:val="18"/>
+        </w:rPr>
+      </w:pPr>
+      <w:r>
+        <w:rPr>
+          <w:rtl w:val="0"/>
+        </w:rPr>
+      </w:r>
+    </w:p>
+    <w:p>
+      <w:pPr>
+        <w:shd w:fill="ffffff" w:val="clear"/>
         <w:rPr>
           <w:sz w:val="18"/>
           <w:szCs w:val="18"/>
@@ -348,18 +324,16 @@
     </w:p>
     <w:p>
       <w:pPr>
-        <w:shd w:fill="ececec" w:val="clear"/>
-        <w:rPr>
-          <w:sz w:val="18"/>
-          <w:szCs w:val="18"/>
-          <w:shd w:fill="6aa84f" w:val="clear"/>
-        </w:rPr>
-      </w:pPr>
-      <w:r>
-        <w:rPr>
-          <w:sz w:val="18"/>
-          <w:szCs w:val="18"/>
-          <w:shd w:fill="6aa84f" w:val="clear"/>
+        <w:shd w:fill="ffffff" w:val="clear"/>
+        <w:rPr>
+          <w:sz w:val="18"/>
+          <w:szCs w:val="18"/>
+        </w:rPr>
+      </w:pPr>
+      <w:r>
+        <w:rPr>
+          <w:sz w:val="18"/>
+          <w:szCs w:val="18"/>
           <w:rtl w:val="0"/>
         </w:rPr>
         <w:t xml:space="preserve">Observacao_Evolucao(</w:t>
@@ -369,7 +343,6 @@
           <w:sz w:val="18"/>
           <w:szCs w:val="18"/>
           <w:u w:val="single"/>
-          <w:shd w:fill="6aa84f" w:val="clear"/>
           <w:rtl w:val="0"/>
         </w:rPr>
         <w:t xml:space="preserve">id_obs_evolucao, #id_evolucao, </w:t>
@@ -378,7 +351,6 @@
         <w:rPr>
           <w:sz w:val="18"/>
           <w:szCs w:val="18"/>
-          <w:shd w:fill="6aa84f" w:val="clear"/>
           <w:rtl w:val="0"/>
         </w:rPr>
         <w:t xml:space="preserve">observacao_evolucao*)</w:t>
@@ -386,18 +358,16 @@
     </w:p>
     <w:p>
       <w:pPr>
-        <w:shd w:fill="ececec" w:val="clear"/>
-        <w:rPr>
-          <w:sz w:val="18"/>
-          <w:szCs w:val="18"/>
-          <w:shd w:fill="6aa84f" w:val="clear"/>
-        </w:rPr>
-      </w:pPr>
-      <w:r>
-        <w:rPr>
-          <w:sz w:val="18"/>
-          <w:szCs w:val="18"/>
-          <w:shd w:fill="6aa84f" w:val="clear"/>
+        <w:shd w:fill="ffffff" w:val="clear"/>
+        <w:rPr>
+          <w:sz w:val="18"/>
+          <w:szCs w:val="18"/>
+        </w:rPr>
+      </w:pPr>
+      <w:r>
+        <w:rPr>
+          <w:sz w:val="18"/>
+          <w:szCs w:val="18"/>
           <w:rtl w:val="0"/>
         </w:rPr>
         <w:t xml:space="preserve">Meta_Alcancada_Evolucao(</w:t>
@@ -407,7 +377,6 @@
           <w:sz w:val="18"/>
           <w:szCs w:val="18"/>
           <w:u w:val="single"/>
-          <w:shd w:fill="6aa84f" w:val="clear"/>
           <w:rtl w:val="0"/>
         </w:rPr>
         <w:t xml:space="preserve">id_metas, #id_evolucao</w:t>
@@ -416,7 +385,6 @@
         <w:rPr>
           <w:sz w:val="18"/>
           <w:szCs w:val="18"/>
-          <w:shd w:fill="6aa84f" w:val="clear"/>
           <w:rtl w:val="0"/>
         </w:rPr>
         <w:t xml:space="preserve">, metas_alcancadas*)</w:t>
@@ -424,7 +392,7 @@
     </w:p>
     <w:p>
       <w:pPr>
-        <w:shd w:fill="ececec" w:val="clear"/>
+        <w:shd w:fill="ffffff" w:val="clear"/>
         <w:rPr>
           <w:sz w:val="18"/>
           <w:szCs w:val="18"/>
@@ -458,7 +426,7 @@
     </w:p>
     <w:p>
       <w:pPr>
-        <w:shd w:fill="ececec" w:val="clear"/>
+        <w:shd w:fill="ffffff" w:val="clear"/>
         <w:rPr>
           <w:sz w:val="18"/>
           <w:szCs w:val="18"/>
@@ -492,32 +460,30 @@
     </w:p>
     <w:p>
       <w:pPr>
-        <w:shd w:fill="ececec" w:val="clear"/>
-        <w:rPr>
-          <w:sz w:val="18"/>
-          <w:szCs w:val="18"/>
-        </w:rPr>
-      </w:pPr>
-      <w:r>
-        <w:rPr>
-          <w:rtl w:val="0"/>
-        </w:rPr>
-      </w:r>
-    </w:p>
-    <w:p>
-      <w:pPr>
-        <w:shd w:fill="ececec" w:val="clear"/>
-        <w:rPr>
-          <w:sz w:val="18"/>
-          <w:szCs w:val="18"/>
-          <w:shd w:fill="6aa84f" w:val="clear"/>
-        </w:rPr>
-      </w:pPr>
-      <w:r>
-        <w:rPr>
-          <w:sz w:val="18"/>
-          <w:szCs w:val="18"/>
-          <w:shd w:fill="6aa84f" w:val="clear"/>
+        <w:shd w:fill="ffffff" w:val="clear"/>
+        <w:rPr>
+          <w:sz w:val="18"/>
+          <w:szCs w:val="18"/>
+        </w:rPr>
+      </w:pPr>
+      <w:r>
+        <w:rPr>
+          <w:rtl w:val="0"/>
+        </w:rPr>
+      </w:r>
+    </w:p>
+    <w:p>
+      <w:pPr>
+        <w:shd w:fill="ffffff" w:val="clear"/>
+        <w:rPr>
+          <w:sz w:val="18"/>
+          <w:szCs w:val="18"/>
+        </w:rPr>
+      </w:pPr>
+      <w:r>
+        <w:rPr>
+          <w:sz w:val="18"/>
+          <w:szCs w:val="18"/>
           <w:rtl w:val="0"/>
         </w:rPr>
         <w:t xml:space="preserve">Plano_Treino(</w:t>
@@ -527,7 +493,6 @@
           <w:sz w:val="18"/>
           <w:szCs w:val="18"/>
           <w:u w:val="single"/>
-          <w:shd w:fill="6aa84f" w:val="clear"/>
           <w:rtl w:val="0"/>
         </w:rPr>
         <w:t xml:space="preserve">id_plano_treino</w:t>
@@ -536,7 +501,6 @@
         <w:rPr>
           <w:sz w:val="18"/>
           <w:szCs w:val="18"/>
-          <w:shd w:fill="6aa84f" w:val="clear"/>
           <w:rtl w:val="0"/>
         </w:rPr>
         <w:t xml:space="preserve">, status*, dificuldade, data_inicio*, data_fim, duracao, frequencia_semanal, #id_consulta_fisica*)</w:t>
@@ -544,18 +508,16 @@
     </w:p>
     <w:p>
       <w:pPr>
-        <w:shd w:fill="ececec" w:val="clear"/>
-        <w:rPr>
-          <w:sz w:val="18"/>
-          <w:szCs w:val="18"/>
-          <w:shd w:fill="6aa84f" w:val="clear"/>
-        </w:rPr>
-      </w:pPr>
-      <w:r>
-        <w:rPr>
-          <w:sz w:val="18"/>
-          <w:szCs w:val="18"/>
-          <w:shd w:fill="6aa84f" w:val="clear"/>
+        <w:shd w:fill="ffffff" w:val="clear"/>
+        <w:rPr>
+          <w:sz w:val="18"/>
+          <w:szCs w:val="18"/>
+        </w:rPr>
+      </w:pPr>
+      <w:r>
+        <w:rPr>
+          <w:sz w:val="18"/>
+          <w:szCs w:val="18"/>
           <w:rtl w:val="0"/>
         </w:rPr>
         <w:t xml:space="preserve">Objetivo_Treino(</w:t>
@@ -565,7 +527,6 @@
           <w:sz w:val="18"/>
           <w:szCs w:val="18"/>
           <w:u w:val="single"/>
-          <w:shd w:fill="6aa84f" w:val="clear"/>
           <w:rtl w:val="0"/>
         </w:rPr>
         <w:t xml:space="preserve">id_obj_treino, #id_plano_treino</w:t>
@@ -574,7 +535,6 @@
         <w:rPr>
           <w:sz w:val="18"/>
           <w:szCs w:val="18"/>
-          <w:shd w:fill="6aa84f" w:val="clear"/>
           <w:rtl w:val="0"/>
         </w:rPr>
         <w:t xml:space="preserve">, objetivos*)</w:t>
@@ -582,18 +542,16 @@
     </w:p>
     <w:p>
       <w:pPr>
-        <w:shd w:fill="ececec" w:val="clear"/>
-        <w:rPr>
-          <w:sz w:val="18"/>
-          <w:szCs w:val="18"/>
-          <w:shd w:fill="6aa84f" w:val="clear"/>
-        </w:rPr>
-      </w:pPr>
-      <w:r>
-        <w:rPr>
-          <w:sz w:val="18"/>
-          <w:szCs w:val="18"/>
-          <w:shd w:fill="6aa84f" w:val="clear"/>
+        <w:shd w:fill="ffffff" w:val="clear"/>
+        <w:rPr>
+          <w:sz w:val="18"/>
+          <w:szCs w:val="18"/>
+        </w:rPr>
+      </w:pPr>
+      <w:r>
+        <w:rPr>
+          <w:sz w:val="18"/>
+          <w:szCs w:val="18"/>
           <w:rtl w:val="0"/>
         </w:rPr>
         <w:t xml:space="preserve">Observacao_Geral_Plano_Treino(</w:t>
@@ -603,7 +561,6 @@
           <w:sz w:val="18"/>
           <w:szCs w:val="18"/>
           <w:u w:val="single"/>
-          <w:shd w:fill="6aa84f" w:val="clear"/>
           <w:rtl w:val="0"/>
         </w:rPr>
         <w:t xml:space="preserve">id_obs_geral_pt, #id_plano_treino</w:t>
@@ -612,7 +569,6 @@
         <w:rPr>
           <w:sz w:val="18"/>
           <w:szCs w:val="18"/>
-          <w:shd w:fill="6aa84f" w:val="clear"/>
           <w:rtl w:val="0"/>
         </w:rPr>
         <w:t xml:space="preserve">, obs_geral*)</w:t>
@@ -620,7 +576,7 @@
     </w:p>
     <w:p>
       <w:pPr>
-        <w:shd w:fill="ececec" w:val="clear"/>
+        <w:shd w:fill="ffffff" w:val="clear"/>
         <w:rPr>
           <w:sz w:val="18"/>
           <w:szCs w:val="18"/>
@@ -654,7 +610,7 @@
     </w:p>
     <w:p>
       <w:pPr>
-        <w:shd w:fill="ececec" w:val="clear"/>
+        <w:shd w:fill="ffffff" w:val="clear"/>
         <w:rPr>
           <w:sz w:val="18"/>
           <w:szCs w:val="18"/>
@@ -688,18 +644,16 @@
     </w:p>
     <w:p>
       <w:pPr>
-        <w:shd w:fill="ececec" w:val="clear"/>
-        <w:rPr>
-          <w:sz w:val="18"/>
-          <w:szCs w:val="18"/>
-          <w:shd w:fill="6aa84f" w:val="clear"/>
-        </w:rPr>
-      </w:pPr>
-      <w:r>
-        <w:rPr>
-          <w:sz w:val="18"/>
-          <w:szCs w:val="18"/>
-          <w:shd w:fill="6aa84f" w:val="clear"/>
+        <w:shd w:fill="ffffff" w:val="clear"/>
+        <w:rPr>
+          <w:sz w:val="18"/>
+          <w:szCs w:val="18"/>
+        </w:rPr>
+      </w:pPr>
+      <w:r>
+        <w:rPr>
+          <w:sz w:val="18"/>
+          <w:szCs w:val="18"/>
           <w:rtl w:val="0"/>
         </w:rPr>
         <w:t xml:space="preserve">Observacao_Tecnica(</w:t>
@@ -709,61 +663,41 @@
           <w:sz w:val="18"/>
           <w:szCs w:val="18"/>
           <w:u w:val="single"/>
-          <w:shd w:fill="6aa84f" w:val="clear"/>
-          <w:rtl w:val="0"/>
-        </w:rPr>
-        <w:t xml:space="preserve">id_obs_tecnica, #id_exercicio,</w:t>
-      </w:r>
-      <w:r>
-        <w:rPr>
-          <w:sz w:val="18"/>
-          <w:szCs w:val="18"/>
-          <w:u w:val="single"/>
-          <w:rtl w:val="0"/>
-        </w:rPr>
-        <w:t xml:space="preserve"> #id_plano_treino</w:t>
-      </w:r>
-      <w:r>
-        <w:rPr>
-          <w:sz w:val="18"/>
-          <w:szCs w:val="18"/>
-          <w:shd w:fill="6aa84f" w:val="clear"/>
+          <w:rtl w:val="0"/>
+        </w:rPr>
+        <w:t xml:space="preserve">id_obs_tecnica, #id_exercicio, #id_plano_treino</w:t>
+      </w:r>
+      <w:r>
+        <w:rPr>
+          <w:sz w:val="18"/>
+          <w:szCs w:val="18"/>
           <w:rtl w:val="0"/>
         </w:rPr>
         <w:t xml:space="preserve">, observacoes*)</w:t>
       </w:r>
-    </w:p>
-    <w:p>
-      <w:pPr>
-        <w:shd w:fill="ececec" w:val="clear"/>
-        <w:rPr>
-          <w:sz w:val="18"/>
-          <w:szCs w:val="18"/>
-        </w:rPr>
-      </w:pPr>
-      <w:r>
-        <w:rPr>
-          <w:rtl w:val="0"/>
-        </w:rPr>
-      </w:r>
-    </w:p>
-    <w:p>
-      <w:pPr>
-        <w:shd w:fill="ececec" w:val="clear"/>
-        <w:rPr>
-          <w:sz w:val="18"/>
-          <w:szCs w:val="18"/>
-        </w:rPr>
-      </w:pPr>
-      <w:r>
-        <w:rPr>
-          <w:rtl w:val="0"/>
-        </w:rPr>
-      </w:r>
-    </w:p>
-    <w:p>
-      <w:pPr>
-        <w:shd w:fill="ececec" w:val="clear"/>
+      <w:r>
+        <w:rPr>
+          <w:rtl w:val="0"/>
+        </w:rPr>
+      </w:r>
+    </w:p>
+    <w:p>
+      <w:pPr>
+        <w:shd w:fill="ffffff" w:val="clear"/>
+        <w:rPr>
+          <w:sz w:val="18"/>
+          <w:szCs w:val="18"/>
+        </w:rPr>
+      </w:pPr>
+      <w:r>
+        <w:rPr>
+          <w:rtl w:val="0"/>
+        </w:rPr>
+      </w:r>
+    </w:p>
+    <w:p>
+      <w:pPr>
+        <w:shd w:fill="ffffff" w:val="clear"/>
         <w:rPr>
           <w:sz w:val="18"/>
           <w:szCs w:val="18"/>
@@ -798,7 +732,6 @@
         <w:rPr>
           <w:sz w:val="18"/>
           <w:szCs w:val="18"/>
-          <w:shd w:fill="6aa84f" w:val="clear"/>
           <w:rtl w:val="0"/>
         </w:rPr>
         <w:t xml:space="preserve"> status_pag*</w:t>
@@ -814,18 +747,16 @@
     </w:p>
     <w:p>
       <w:pPr>
-        <w:shd w:fill="ececec" w:val="clear"/>
-        <w:rPr>
-          <w:sz w:val="18"/>
-          <w:szCs w:val="18"/>
-          <w:shd w:fill="6aa84f" w:val="clear"/>
-        </w:rPr>
-      </w:pPr>
-      <w:r>
-        <w:rPr>
-          <w:sz w:val="18"/>
-          <w:szCs w:val="18"/>
-          <w:shd w:fill="6aa84f" w:val="clear"/>
+        <w:shd w:fill="ffffff" w:val="clear"/>
+        <w:rPr>
+          <w:sz w:val="18"/>
+          <w:szCs w:val="18"/>
+        </w:rPr>
+      </w:pPr>
+      <w:r>
+        <w:rPr>
+          <w:sz w:val="18"/>
+          <w:szCs w:val="18"/>
           <w:rtl w:val="0"/>
         </w:rPr>
         <w:t xml:space="preserve">Observacao_Pagamento(</w:t>
@@ -835,7 +766,6 @@
           <w:sz w:val="18"/>
           <w:szCs w:val="18"/>
           <w:u w:val="single"/>
-          <w:shd w:fill="6aa84f" w:val="clear"/>
           <w:rtl w:val="0"/>
         </w:rPr>
         <w:t xml:space="preserve">id_obs_pag, #id_pagamento</w:t>
@@ -844,7 +774,6 @@
         <w:rPr>
           <w:sz w:val="18"/>
           <w:szCs w:val="18"/>
-          <w:shd w:fill="6aa84f" w:val="clear"/>
           <w:rtl w:val="0"/>
         </w:rPr>
         <w:t xml:space="preserve">, observacao*)</w:t>
@@ -852,18 +781,16 @@
     </w:p>
     <w:p>
       <w:pPr>
-        <w:shd w:fill="ececec" w:val="clear"/>
-        <w:rPr>
-          <w:sz w:val="18"/>
-          <w:szCs w:val="18"/>
-          <w:shd w:fill="6aa84f" w:val="clear"/>
-        </w:rPr>
-      </w:pPr>
-      <w:r>
-        <w:rPr>
-          <w:sz w:val="18"/>
-          <w:szCs w:val="18"/>
-          <w:shd w:fill="6aa84f" w:val="clear"/>
+        <w:shd w:fill="ffffff" w:val="clear"/>
+        <w:rPr>
+          <w:sz w:val="18"/>
+          <w:szCs w:val="18"/>
+        </w:rPr>
+      </w:pPr>
+      <w:r>
+        <w:rPr>
+          <w:sz w:val="18"/>
+          <w:szCs w:val="18"/>
           <w:rtl w:val="0"/>
         </w:rPr>
         <w:t xml:space="preserve">Contrata_Plano(</w:t>
@@ -873,7 +800,6 @@
           <w:sz w:val="18"/>
           <w:szCs w:val="18"/>
           <w:u w:val="single"/>
-          <w:shd w:fill="6aa84f" w:val="clear"/>
           <w:rtl w:val="0"/>
         </w:rPr>
         <w:t xml:space="preserve">id_contrato</w:t>
@@ -882,7 +808,6 @@
         <w:rPr>
           <w:sz w:val="18"/>
           <w:szCs w:val="18"/>
-          <w:shd w:fill="6aa84f" w:val="clear"/>
           <w:rtl w:val="0"/>
         </w:rPr>
         <w:t xml:space="preserve">, #id_plano_servico*, #id_paciente*, data_de_adesao*</w:t>
@@ -892,7 +817,6 @@
           <w:sz w:val="18"/>
           <w:szCs w:val="18"/>
           <w:u w:val="single"/>
-          <w:shd w:fill="6aa84f" w:val="clear"/>
           <w:rtl w:val="0"/>
         </w:rPr>
         <w:t xml:space="preserve">,</w:t>
@@ -901,7 +825,6 @@
         <w:rPr>
           <w:sz w:val="18"/>
           <w:szCs w:val="18"/>
-          <w:shd w:fill="6aa84f" w:val="clear"/>
           <w:rtl w:val="0"/>
         </w:rPr>
         <w:t xml:space="preserve"> status_contratacao*)</w:t>
@@ -909,18 +832,16 @@
     </w:p>
     <w:p>
       <w:pPr>
-        <w:shd w:fill="ececec" w:val="clear"/>
-        <w:rPr>
-          <w:sz w:val="18"/>
-          <w:szCs w:val="18"/>
-          <w:shd w:fill="6aa84f" w:val="clear"/>
-        </w:rPr>
-      </w:pPr>
-      <w:r>
-        <w:rPr>
-          <w:sz w:val="18"/>
-          <w:szCs w:val="18"/>
-          <w:shd w:fill="6aa84f" w:val="clear"/>
+        <w:shd w:fill="ffffff" w:val="clear"/>
+        <w:rPr>
+          <w:sz w:val="18"/>
+          <w:szCs w:val="18"/>
+        </w:rPr>
+      </w:pPr>
+      <w:r>
+        <w:rPr>
+          <w:sz w:val="18"/>
+          <w:szCs w:val="18"/>
           <w:rtl w:val="0"/>
         </w:rPr>
         <w:t xml:space="preserve">Observacao_Contrato(</w:t>
@@ -930,7 +851,6 @@
           <w:sz w:val="18"/>
           <w:szCs w:val="18"/>
           <w:u w:val="single"/>
-          <w:shd w:fill="6aa84f" w:val="clear"/>
           <w:rtl w:val="0"/>
         </w:rPr>
         <w:t xml:space="preserve">id_obs_contrato, #id_contrato</w:t>
@@ -939,7 +859,6 @@
         <w:rPr>
           <w:sz w:val="18"/>
           <w:szCs w:val="18"/>
-          <w:shd w:fill="6aa84f" w:val="clear"/>
           <w:rtl w:val="0"/>
         </w:rPr>
         <w:t xml:space="preserve">, obs_contrato*)</w:t>
@@ -947,7 +866,7 @@
     </w:p>
     <w:p>
       <w:pPr>
-        <w:shd w:fill="ececec" w:val="clear"/>
+        <w:shd w:fill="ffffff" w:val="clear"/>
         <w:rPr>
           <w:sz w:val="18"/>
           <w:szCs w:val="18"/>
@@ -966,7 +885,6 @@
           <w:sz w:val="18"/>
           <w:szCs w:val="18"/>
           <w:u w:val="single"/>
-          <w:shd w:fill="6aa84f" w:val="clear"/>
           <w:rtl w:val="0"/>
         </w:rPr>
         <w:t xml:space="preserve">id_plano_servico</w:t>
@@ -975,7 +893,6 @@
         <w:rPr>
           <w:sz w:val="18"/>
           <w:szCs w:val="18"/>
-          <w:shd w:fill="6aa84f" w:val="clear"/>
           <w:rtl w:val="0"/>
         </w:rPr>
         <w:t xml:space="preserve">,</w:t>
@@ -1007,18 +924,16 @@
     </w:p>
     <w:p>
       <w:pPr>
-        <w:shd w:fill="ececec" w:val="clear"/>
-        <w:rPr>
-          <w:sz w:val="18"/>
-          <w:szCs w:val="18"/>
-          <w:shd w:fill="6aa84f" w:val="clear"/>
-        </w:rPr>
-      </w:pPr>
-      <w:r>
-        <w:rPr>
-          <w:sz w:val="18"/>
-          <w:szCs w:val="18"/>
-          <w:shd w:fill="6aa84f" w:val="clear"/>
+        <w:shd w:fill="ffffff" w:val="clear"/>
+        <w:rPr>
+          <w:sz w:val="18"/>
+          <w:szCs w:val="18"/>
+        </w:rPr>
+      </w:pPr>
+      <w:r>
+        <w:rPr>
+          <w:sz w:val="18"/>
+          <w:szCs w:val="18"/>
           <w:rtl w:val="0"/>
         </w:rPr>
         <w:t xml:space="preserve">Servico_Plano_Servico(</w:t>
@@ -1028,7 +943,6 @@
           <w:sz w:val="18"/>
           <w:szCs w:val="18"/>
           <w:u w:val="single"/>
-          <w:shd w:fill="6aa84f" w:val="clear"/>
           <w:rtl w:val="0"/>
         </w:rPr>
         <w:t xml:space="preserve">id_servico_plano_servico, #</w:t>
@@ -1038,7 +952,6 @@
           <w:sz w:val="18"/>
           <w:szCs w:val="18"/>
           <w:u w:val="single"/>
-          <w:shd w:fill="6aa84f" w:val="clear"/>
           <w:rtl w:val="0"/>
         </w:rPr>
         <w:t xml:space="preserve">id_plano_servico</w:t>
@@ -1047,7 +960,6 @@
         <w:rPr>
           <w:sz w:val="18"/>
           <w:szCs w:val="18"/>
-          <w:shd w:fill="6aa84f" w:val="clear"/>
           <w:rtl w:val="0"/>
         </w:rPr>
         <w:t xml:space="preserve">, servicos*) </w:t>
@@ -1055,18 +967,16 @@
     </w:p>
     <w:p>
       <w:pPr>
-        <w:shd w:fill="ececec" w:val="clear"/>
-        <w:rPr>
-          <w:sz w:val="18"/>
-          <w:szCs w:val="18"/>
-          <w:shd w:fill="6aa84f" w:val="clear"/>
-        </w:rPr>
-      </w:pPr>
-      <w:r>
-        <w:rPr>
-          <w:sz w:val="18"/>
-          <w:szCs w:val="18"/>
-          <w:shd w:fill="6aa84f" w:val="clear"/>
+        <w:shd w:fill="ffffff" w:val="clear"/>
+        <w:rPr>
+          <w:sz w:val="18"/>
+          <w:szCs w:val="18"/>
+        </w:rPr>
+      </w:pPr>
+      <w:r>
+        <w:rPr>
+          <w:sz w:val="18"/>
+          <w:szCs w:val="18"/>
           <w:rtl w:val="0"/>
         </w:rPr>
         <w:t xml:space="preserve">Profissional(</w:t>
@@ -1076,7 +986,6 @@
           <w:sz w:val="18"/>
           <w:szCs w:val="18"/>
           <w:u w:val="single"/>
-          <w:shd w:fill="6aa84f" w:val="clear"/>
           <w:rtl w:val="0"/>
         </w:rPr>
         <w:t xml:space="preserve">id_profissional</w:t>
@@ -1085,7 +994,6 @@
         <w:rPr>
           <w:sz w:val="18"/>
           <w:szCs w:val="18"/>
-          <w:shd w:fill="6aa84f" w:val="clear"/>
           <w:rtl w:val="0"/>
         </w:rPr>
         <w:t xml:space="preserve">, nome*, cpf*, email, endereco_cep, endereco_estado, endereco_cidade, status*, data_contrato*)</w:t>
@@ -1093,18 +1001,16 @@
     </w:p>
     <w:p>
       <w:pPr>
-        <w:shd w:fill="ececec" w:val="clear"/>
-        <w:rPr>
-          <w:sz w:val="18"/>
-          <w:szCs w:val="18"/>
-          <w:shd w:fill="6aa84f" w:val="clear"/>
-        </w:rPr>
-      </w:pPr>
-      <w:r>
-        <w:rPr>
-          <w:sz w:val="18"/>
-          <w:szCs w:val="18"/>
-          <w:shd w:fill="6aa84f" w:val="clear"/>
+        <w:shd w:fill="ffffff" w:val="clear"/>
+        <w:rPr>
+          <w:sz w:val="18"/>
+          <w:szCs w:val="18"/>
+        </w:rPr>
+      </w:pPr>
+      <w:r>
+        <w:rPr>
+          <w:sz w:val="18"/>
+          <w:szCs w:val="18"/>
           <w:rtl w:val="0"/>
         </w:rPr>
         <w:t xml:space="preserve">Disponibilidade_Profissional(</w:t>
@@ -1114,7 +1020,6 @@
           <w:sz w:val="18"/>
           <w:szCs w:val="18"/>
           <w:u w:val="single"/>
-          <w:shd w:fill="6aa84f" w:val="clear"/>
           <w:rtl w:val="0"/>
         </w:rPr>
         <w:t xml:space="preserve">id_dispo_pro, #id_profissional</w:t>
@@ -1123,7 +1028,6 @@
         <w:rPr>
           <w:sz w:val="18"/>
           <w:szCs w:val="18"/>
-          <w:shd w:fill="6aa84f" w:val="clear"/>
           <w:rtl w:val="0"/>
         </w:rPr>
         <w:t xml:space="preserve">, dia_semana*, hora_ini*, hora_fim*)</w:t>
@@ -1131,7 +1035,7 @@
     </w:p>
     <w:p>
       <w:pPr>
-        <w:shd w:fill="ececec" w:val="clear"/>
+        <w:shd w:fill="ffffff" w:val="clear"/>
         <w:rPr>
           <w:sz w:val="18"/>
           <w:szCs w:val="18"/>
@@ -1165,21 +1069,21 @@
     </w:p>
     <w:p>
       <w:pPr>
-        <w:shd w:fill="ececec" w:val="clear"/>
-        <w:rPr>
-          <w:sz w:val="18"/>
-          <w:szCs w:val="18"/>
-        </w:rPr>
-      </w:pPr>
-      <w:r>
-        <w:rPr>
-          <w:rtl w:val="0"/>
-        </w:rPr>
-      </w:r>
-    </w:p>
-    <w:p>
-      <w:pPr>
-        <w:shd w:fill="ececec" w:val="clear"/>
+        <w:shd w:fill="ffffff" w:val="clear"/>
+        <w:rPr>
+          <w:sz w:val="18"/>
+          <w:szCs w:val="18"/>
+        </w:rPr>
+      </w:pPr>
+      <w:r>
+        <w:rPr>
+          <w:rtl w:val="0"/>
+        </w:rPr>
+      </w:r>
+    </w:p>
+    <w:p>
+      <w:pPr>
+        <w:shd w:fill="ffffff" w:val="clear"/>
         <w:rPr>
           <w:sz w:val="18"/>
           <w:szCs w:val="18"/>
@@ -1213,17 +1117,16 @@
     </w:p>
     <w:p>
       <w:pPr>
-        <w:shd w:fill="ececec" w:val="clear"/>
-        <w:rPr>
-          <w:sz w:val="18"/>
-          <w:szCs w:val="18"/>
-        </w:rPr>
-      </w:pPr>
-      <w:r>
-        <w:rPr>
-          <w:sz w:val="18"/>
-          <w:szCs w:val="18"/>
-          <w:shd w:fill="6aa84f" w:val="clear"/>
+        <w:shd w:fill="ffffff" w:val="clear"/>
+        <w:rPr>
+          <w:sz w:val="18"/>
+          <w:szCs w:val="18"/>
+        </w:rPr>
+      </w:pPr>
+      <w:r>
+        <w:rPr>
+          <w:sz w:val="18"/>
+          <w:szCs w:val="18"/>
           <w:rtl w:val="0"/>
         </w:rPr>
         <w:t xml:space="preserve">Especialidade_Nutricionista(</w:t>
@@ -1233,7 +1136,6 @@
           <w:sz w:val="18"/>
           <w:szCs w:val="18"/>
           <w:u w:val="single"/>
-          <w:shd w:fill="6aa84f" w:val="clear"/>
           <w:rtl w:val="0"/>
         </w:rPr>
         <w:t xml:space="preserve">id_especialidade_nutri, #id_profissional</w:t>
@@ -1242,7 +1144,6 @@
         <w:rPr>
           <w:sz w:val="18"/>
           <w:szCs w:val="18"/>
-          <w:shd w:fill="6aa84f" w:val="clear"/>
           <w:rtl w:val="0"/>
         </w:rPr>
         <w:t xml:space="preserve">, especialidade*)</w:t>
@@ -1255,7 +1156,7 @@
     </w:p>
     <w:p>
       <w:pPr>
-        <w:shd w:fill="ececec" w:val="clear"/>
+        <w:shd w:fill="ffffff" w:val="clear"/>
         <w:rPr>
           <w:sz w:val="18"/>
           <w:szCs w:val="18"/>
@@ -1289,18 +1190,16 @@
     </w:p>
     <w:p>
       <w:pPr>
-        <w:shd w:fill="ececec" w:val="clear"/>
-        <w:rPr>
-          <w:sz w:val="18"/>
-          <w:szCs w:val="18"/>
-          <w:shd w:fill="6aa84f" w:val="clear"/>
-        </w:rPr>
-      </w:pPr>
-      <w:r>
-        <w:rPr>
-          <w:sz w:val="18"/>
-          <w:szCs w:val="18"/>
-          <w:shd w:fill="6aa84f" w:val="clear"/>
+        <w:shd w:fill="ffffff" w:val="clear"/>
+        <w:rPr>
+          <w:sz w:val="18"/>
+          <w:szCs w:val="18"/>
+        </w:rPr>
+      </w:pPr>
+      <w:r>
+        <w:rPr>
+          <w:sz w:val="18"/>
+          <w:szCs w:val="18"/>
           <w:rtl w:val="0"/>
         </w:rPr>
         <w:t xml:space="preserve">Especialidade_Educador(</w:t>
@@ -1310,7 +1209,6 @@
           <w:sz w:val="18"/>
           <w:szCs w:val="18"/>
           <w:u w:val="single"/>
-          <w:shd w:fill="6aa84f" w:val="clear"/>
           <w:rtl w:val="0"/>
         </w:rPr>
         <w:t xml:space="preserve">id_especialidade_edu, #id_profissional</w:t>
@@ -1319,7 +1217,6 @@
         <w:rPr>
           <w:sz w:val="18"/>
           <w:szCs w:val="18"/>
-          <w:shd w:fill="6aa84f" w:val="clear"/>
           <w:rtl w:val="0"/>
         </w:rPr>
         <w:t xml:space="preserve">, especializacao*)</w:t>
@@ -1327,21 +1224,21 @@
     </w:p>
     <w:p>
       <w:pPr>
-        <w:shd w:fill="ececec" w:val="clear"/>
-        <w:rPr>
-          <w:sz w:val="18"/>
-          <w:szCs w:val="18"/>
-        </w:rPr>
-      </w:pPr>
-      <w:r>
-        <w:rPr>
-          <w:rtl w:val="0"/>
-        </w:rPr>
-      </w:r>
-    </w:p>
-    <w:p>
-      <w:pPr>
-        <w:shd w:fill="ececec" w:val="clear"/>
+        <w:shd w:fill="ffffff" w:val="clear"/>
+        <w:rPr>
+          <w:sz w:val="18"/>
+          <w:szCs w:val="18"/>
+        </w:rPr>
+      </w:pPr>
+      <w:r>
+        <w:rPr>
+          <w:rtl w:val="0"/>
+        </w:rPr>
+      </w:r>
+    </w:p>
+    <w:p>
+      <w:pPr>
+        <w:shd w:fill="ffffff" w:val="clear"/>
         <w:rPr>
           <w:sz w:val="18"/>
           <w:szCs w:val="18"/>
@@ -1375,18 +1272,16 @@
     </w:p>
     <w:p>
       <w:pPr>
-        <w:shd w:fill="ececec" w:val="clear"/>
-        <w:rPr>
-          <w:sz w:val="18"/>
-          <w:szCs w:val="18"/>
-          <w:shd w:fill="6aa84f" w:val="clear"/>
-        </w:rPr>
-      </w:pPr>
-      <w:r>
-        <w:rPr>
-          <w:sz w:val="18"/>
-          <w:szCs w:val="18"/>
-          <w:shd w:fill="6aa84f" w:val="clear"/>
+        <w:shd w:fill="ffffff" w:val="clear"/>
+        <w:rPr>
+          <w:sz w:val="18"/>
+          <w:szCs w:val="18"/>
+        </w:rPr>
+      </w:pPr>
+      <w:r>
+        <w:rPr>
+          <w:sz w:val="18"/>
+          <w:szCs w:val="18"/>
           <w:rtl w:val="0"/>
         </w:rPr>
         <w:t xml:space="preserve">Objetivo_Fisico_Paciente(</w:t>
@@ -1396,7 +1291,6 @@
           <w:sz w:val="18"/>
           <w:szCs w:val="18"/>
           <w:u w:val="single"/>
-          <w:shd w:fill="6aa84f" w:val="clear"/>
           <w:rtl w:val="0"/>
         </w:rPr>
         <w:t xml:space="preserve">id_obj_paciente, #id_consulta_fisica,</w:t>
@@ -1405,7 +1299,6 @@
         <w:rPr>
           <w:sz w:val="18"/>
           <w:szCs w:val="18"/>
-          <w:shd w:fill="6aa84f" w:val="clear"/>
           <w:rtl w:val="0"/>
         </w:rPr>
         <w:t xml:space="preserve"> objetivo*)</w:t>
@@ -1413,18 +1306,16 @@
     </w:p>
     <w:p>
       <w:pPr>
-        <w:shd w:fill="ececec" w:val="clear"/>
-        <w:rPr>
-          <w:sz w:val="18"/>
-          <w:szCs w:val="18"/>
-          <w:shd w:fill="6aa84f" w:val="clear"/>
-        </w:rPr>
-      </w:pPr>
-      <w:r>
-        <w:rPr>
-          <w:sz w:val="18"/>
-          <w:szCs w:val="18"/>
-          <w:shd w:fill="6aa84f" w:val="clear"/>
+        <w:shd w:fill="ffffff" w:val="clear"/>
+        <w:rPr>
+          <w:sz w:val="18"/>
+          <w:szCs w:val="18"/>
+        </w:rPr>
+      </w:pPr>
+      <w:r>
+        <w:rPr>
+          <w:sz w:val="18"/>
+          <w:szCs w:val="18"/>
           <w:rtl w:val="0"/>
         </w:rPr>
         <w:t xml:space="preserve">Recomendacao_Fisica(</w:t>
@@ -1434,7 +1325,6 @@
           <w:sz w:val="18"/>
           <w:szCs w:val="18"/>
           <w:u w:val="single"/>
-          <w:shd w:fill="6aa84f" w:val="clear"/>
           <w:rtl w:val="0"/>
         </w:rPr>
         <w:t xml:space="preserve">id_recom_fisica, #id_consulta_fisica</w:t>
@@ -1443,7 +1333,6 @@
         <w:rPr>
           <w:sz w:val="18"/>
           <w:szCs w:val="18"/>
-          <w:shd w:fill="6aa84f" w:val="clear"/>
           <w:rtl w:val="0"/>
         </w:rPr>
         <w:t xml:space="preserve">, recomendacao*)</w:t>
@@ -1451,18 +1340,16 @@
     </w:p>
     <w:p>
       <w:pPr>
-        <w:shd w:fill="ececec" w:val="clear"/>
-        <w:rPr>
-          <w:sz w:val="18"/>
-          <w:szCs w:val="18"/>
-          <w:shd w:fill="6aa84f" w:val="clear"/>
-        </w:rPr>
-      </w:pPr>
-      <w:r>
-        <w:rPr>
-          <w:sz w:val="18"/>
-          <w:szCs w:val="18"/>
-          <w:shd w:fill="6aa84f" w:val="clear"/>
+        <w:shd w:fill="ffffff" w:val="clear"/>
+        <w:rPr>
+          <w:sz w:val="18"/>
+          <w:szCs w:val="18"/>
+        </w:rPr>
+      </w:pPr>
+      <w:r>
+        <w:rPr>
+          <w:sz w:val="18"/>
+          <w:szCs w:val="18"/>
           <w:rtl w:val="0"/>
         </w:rPr>
         <w:t xml:space="preserve">Observacao_Geral_Consulta_Fisica(</w:t>
@@ -1472,7 +1359,6 @@
           <w:sz w:val="18"/>
           <w:szCs w:val="18"/>
           <w:u w:val="single"/>
-          <w:shd w:fill="6aa84f" w:val="clear"/>
           <w:rtl w:val="0"/>
         </w:rPr>
         <w:t xml:space="preserve">id_obs_geral_cf, #id_consulta_fisica,</w:t>
@@ -1481,7 +1367,6 @@
         <w:rPr>
           <w:sz w:val="18"/>
           <w:szCs w:val="18"/>
-          <w:shd w:fill="6aa84f" w:val="clear"/>
           <w:rtl w:val="0"/>
         </w:rPr>
         <w:t xml:space="preserve"> obs_geral*)</w:t>
@@ -1489,21 +1374,21 @@
     </w:p>
     <w:p>
       <w:pPr>
-        <w:shd w:fill="ececec" w:val="clear"/>
-        <w:rPr>
-          <w:sz w:val="18"/>
-          <w:szCs w:val="18"/>
-        </w:rPr>
-      </w:pPr>
-      <w:r>
-        <w:rPr>
-          <w:rtl w:val="0"/>
-        </w:rPr>
-      </w:r>
-    </w:p>
-    <w:p>
-      <w:pPr>
-        <w:shd w:fill="ececec" w:val="clear"/>
+        <w:shd w:fill="ffffff" w:val="clear"/>
+        <w:rPr>
+          <w:sz w:val="18"/>
+          <w:szCs w:val="18"/>
+        </w:rPr>
+      </w:pPr>
+      <w:r>
+        <w:rPr>
+          <w:rtl w:val="0"/>
+        </w:rPr>
+      </w:r>
+    </w:p>
+    <w:p>
+      <w:pPr>
+        <w:shd w:fill="ffffff" w:val="clear"/>
         <w:rPr>
           <w:sz w:val="18"/>
           <w:szCs w:val="18"/>
@@ -1537,18 +1422,16 @@
     </w:p>
     <w:p>
       <w:pPr>
-        <w:shd w:fill="ececec" w:val="clear"/>
-        <w:rPr>
-          <w:sz w:val="18"/>
-          <w:szCs w:val="18"/>
-          <w:shd w:fill="6aa84f" w:val="clear"/>
-        </w:rPr>
-      </w:pPr>
-      <w:r>
-        <w:rPr>
-          <w:sz w:val="18"/>
-          <w:szCs w:val="18"/>
-          <w:shd w:fill="6aa84f" w:val="clear"/>
+        <w:shd w:fill="ffffff" w:val="clear"/>
+        <w:rPr>
+          <w:sz w:val="18"/>
+          <w:szCs w:val="18"/>
+        </w:rPr>
+      </w:pPr>
+      <w:r>
+        <w:rPr>
+          <w:sz w:val="18"/>
+          <w:szCs w:val="18"/>
           <w:rtl w:val="0"/>
         </w:rPr>
         <w:t xml:space="preserve">Intolerancia_Consulta_Nutri(</w:t>
@@ -1558,7 +1441,6 @@
           <w:sz w:val="18"/>
           <w:szCs w:val="18"/>
           <w:u w:val="single"/>
-          <w:shd w:fill="6aa84f" w:val="clear"/>
           <w:rtl w:val="0"/>
         </w:rPr>
         <w:t xml:space="preserve">id_intolerancia_consulta_nutri, #id_consulta_nutricional,</w:t>
@@ -1567,7 +1449,6 @@
         <w:rPr>
           <w:sz w:val="18"/>
           <w:szCs w:val="18"/>
-          <w:shd w:fill="6aa84f" w:val="clear"/>
           <w:rtl w:val="0"/>
         </w:rPr>
         <w:t xml:space="preserve"> intolerancia*)</w:t>
@@ -1575,18 +1456,16 @@
     </w:p>
     <w:p>
       <w:pPr>
-        <w:shd w:fill="ececec" w:val="clear"/>
-        <w:rPr>
-          <w:sz w:val="18"/>
-          <w:szCs w:val="18"/>
-          <w:shd w:fill="6aa84f" w:val="clear"/>
-        </w:rPr>
-      </w:pPr>
-      <w:r>
-        <w:rPr>
-          <w:sz w:val="18"/>
-          <w:szCs w:val="18"/>
-          <w:shd w:fill="6aa84f" w:val="clear"/>
+        <w:shd w:fill="ffffff" w:val="clear"/>
+        <w:rPr>
+          <w:sz w:val="18"/>
+          <w:szCs w:val="18"/>
+        </w:rPr>
+      </w:pPr>
+      <w:r>
+        <w:rPr>
+          <w:sz w:val="18"/>
+          <w:szCs w:val="18"/>
           <w:rtl w:val="0"/>
         </w:rPr>
         <w:t xml:space="preserve">Habito_alimentar(</w:t>
@@ -1596,7 +1475,6 @@
           <w:sz w:val="18"/>
           <w:szCs w:val="18"/>
           <w:u w:val="single"/>
-          <w:shd w:fill="6aa84f" w:val="clear"/>
           <w:rtl w:val="0"/>
         </w:rPr>
         <w:t xml:space="preserve">id_habito_alimentar, #id_consulta_nutricional</w:t>
@@ -1605,7 +1483,6 @@
         <w:rPr>
           <w:sz w:val="18"/>
           <w:szCs w:val="18"/>
-          <w:shd w:fill="6aa84f" w:val="clear"/>
           <w:rtl w:val="0"/>
         </w:rPr>
         <w:t xml:space="preserve">, habito_alimentar*)</w:t>
@@ -1613,33 +1490,30 @@
     </w:p>
     <w:p>
       <w:pPr>
-        <w:shd w:fill="ececec" w:val="clear"/>
-        <w:rPr>
-          <w:sz w:val="18"/>
-          <w:szCs w:val="18"/>
-          <w:shd w:fill="6aa84f" w:val="clear"/>
-        </w:rPr>
-      </w:pPr>
-      <w:r>
-        <w:rPr>
-          <w:rtl w:val="0"/>
-        </w:rPr>
-      </w:r>
-    </w:p>
-    <w:p>
-      <w:pPr>
-        <w:shd w:fill="ececec" w:val="clear"/>
-        <w:rPr>
-          <w:sz w:val="18"/>
-          <w:szCs w:val="18"/>
-          <w:shd w:fill="6aa84f" w:val="clear"/>
-        </w:rPr>
-      </w:pPr>
-      <w:r>
-        <w:rPr>
-          <w:sz w:val="18"/>
-          <w:szCs w:val="18"/>
-          <w:shd w:fill="6aa84f" w:val="clear"/>
+        <w:shd w:fill="ffffff" w:val="clear"/>
+        <w:rPr>
+          <w:sz w:val="18"/>
+          <w:szCs w:val="18"/>
+        </w:rPr>
+      </w:pPr>
+      <w:r>
+        <w:rPr>
+          <w:rtl w:val="0"/>
+        </w:rPr>
+      </w:r>
+    </w:p>
+    <w:p>
+      <w:pPr>
+        <w:shd w:fill="ffffff" w:val="clear"/>
+        <w:rPr>
+          <w:sz w:val="18"/>
+          <w:szCs w:val="18"/>
+        </w:rPr>
+      </w:pPr>
+      <w:r>
+        <w:rPr>
+          <w:sz w:val="18"/>
+          <w:szCs w:val="18"/>
           <w:rtl w:val="0"/>
         </w:rPr>
         <w:t xml:space="preserve">Observacao_Clinica(</w:t>
@@ -1649,7 +1523,6 @@
           <w:sz w:val="18"/>
           <w:szCs w:val="18"/>
           <w:u w:val="single"/>
-          <w:shd w:fill="6aa84f" w:val="clear"/>
           <w:rtl w:val="0"/>
         </w:rPr>
         <w:t xml:space="preserve">id_obs_clinica, #id_consulta_nutricional,</w:t>
@@ -1658,7 +1531,6 @@
         <w:rPr>
           <w:sz w:val="18"/>
           <w:szCs w:val="18"/>
-          <w:shd w:fill="6aa84f" w:val="clear"/>
           <w:rtl w:val="0"/>
         </w:rPr>
         <w:t xml:space="preserve"> observacoes_clinicas*)</w:t>
@@ -1666,18 +1538,16 @@
     </w:p>
     <w:p>
       <w:pPr>
-        <w:shd w:fill="ececec" w:val="clear"/>
-        <w:rPr>
-          <w:sz w:val="18"/>
-          <w:szCs w:val="18"/>
-          <w:shd w:fill="6aa84f" w:val="clear"/>
-        </w:rPr>
-      </w:pPr>
-      <w:r>
-        <w:rPr>
-          <w:sz w:val="18"/>
-          <w:szCs w:val="18"/>
-          <w:shd w:fill="6aa84f" w:val="clear"/>
+        <w:shd w:fill="ffffff" w:val="clear"/>
+        <w:rPr>
+          <w:sz w:val="18"/>
+          <w:szCs w:val="18"/>
+        </w:rPr>
+      </w:pPr>
+      <w:r>
+        <w:rPr>
+          <w:sz w:val="18"/>
+          <w:szCs w:val="18"/>
           <w:rtl w:val="0"/>
         </w:rPr>
         <w:t xml:space="preserve">Recomendacao_Nutricional(</w:t>
@@ -1687,7 +1557,6 @@
           <w:sz w:val="18"/>
           <w:szCs w:val="18"/>
           <w:u w:val="single"/>
-          <w:shd w:fill="6aa84f" w:val="clear"/>
           <w:rtl w:val="0"/>
         </w:rPr>
         <w:t xml:space="preserve">id_recom_nutri, #id_consulta_nutricional</w:t>
@@ -1696,7 +1565,6 @@
         <w:rPr>
           <w:sz w:val="18"/>
           <w:szCs w:val="18"/>
-          <w:shd w:fill="6aa84f" w:val="clear"/>
           <w:rtl w:val="0"/>
         </w:rPr>
         <w:t xml:space="preserve">, recomendacao*)</w:t>
@@ -1704,21 +1572,21 @@
     </w:p>
     <w:p>
       <w:pPr>
-        <w:shd w:fill="ececec" w:val="clear"/>
-        <w:rPr>
-          <w:sz w:val="18"/>
-          <w:szCs w:val="18"/>
-        </w:rPr>
-      </w:pPr>
-      <w:r>
-        <w:rPr>
-          <w:rtl w:val="0"/>
-        </w:rPr>
-      </w:r>
-    </w:p>
-    <w:p>
-      <w:pPr>
-        <w:shd w:fill="ececec" w:val="clear"/>
+        <w:shd w:fill="ffffff" w:val="clear"/>
+        <w:rPr>
+          <w:sz w:val="18"/>
+          <w:szCs w:val="18"/>
+        </w:rPr>
+      </w:pPr>
+      <w:r>
+        <w:rPr>
+          <w:rtl w:val="0"/>
+        </w:rPr>
+      </w:r>
+    </w:p>
+    <w:p>
+      <w:pPr>
+        <w:shd w:fill="ffffff" w:val="clear"/>
         <w:rPr>
           <w:sz w:val="18"/>
           <w:szCs w:val="18"/>
@@ -1752,18 +1620,16 @@
     </w:p>
     <w:p>
       <w:pPr>
-        <w:shd w:fill="ececec" w:val="clear"/>
-        <w:rPr>
-          <w:sz w:val="18"/>
-          <w:szCs w:val="18"/>
-          <w:shd w:fill="6aa84f" w:val="clear"/>
-        </w:rPr>
-      </w:pPr>
-      <w:r>
-        <w:rPr>
-          <w:sz w:val="18"/>
-          <w:szCs w:val="18"/>
-          <w:shd w:fill="6aa84f" w:val="clear"/>
+        <w:shd w:fill="ffffff" w:val="clear"/>
+        <w:rPr>
+          <w:sz w:val="18"/>
+          <w:szCs w:val="18"/>
+        </w:rPr>
+      </w:pPr>
+      <w:r>
+        <w:rPr>
+          <w:sz w:val="18"/>
+          <w:szCs w:val="18"/>
           <w:rtl w:val="0"/>
         </w:rPr>
         <w:t xml:space="preserve">Observacao_Plano_Alimentar(</w:t>
@@ -1773,7 +1639,6 @@
           <w:sz w:val="18"/>
           <w:szCs w:val="18"/>
           <w:u w:val="single"/>
-          <w:shd w:fill="6aa84f" w:val="clear"/>
           <w:rtl w:val="0"/>
         </w:rPr>
         <w:t xml:space="preserve">id_obs_plano_alim, #id_plano_alimentar,</w:t>
@@ -1782,7 +1647,6 @@
         <w:rPr>
           <w:sz w:val="18"/>
           <w:szCs w:val="18"/>
-          <w:shd w:fill="6aa84f" w:val="clear"/>
           <w:rtl w:val="0"/>
         </w:rPr>
         <w:t xml:space="preserve"> obs_geral*)</w:t>
@@ -1790,18 +1654,16 @@
     </w:p>
     <w:p>
       <w:pPr>
-        <w:shd w:fill="ececec" w:val="clear"/>
-        <w:rPr>
-          <w:sz w:val="18"/>
-          <w:szCs w:val="18"/>
-          <w:shd w:fill="6aa84f" w:val="clear"/>
-        </w:rPr>
-      </w:pPr>
-      <w:r>
-        <w:rPr>
-          <w:sz w:val="18"/>
-          <w:szCs w:val="18"/>
-          <w:shd w:fill="6aa84f" w:val="clear"/>
+        <w:shd w:fill="ffffff" w:val="clear"/>
+        <w:rPr>
+          <w:sz w:val="18"/>
+          <w:szCs w:val="18"/>
+        </w:rPr>
+      </w:pPr>
+      <w:r>
+        <w:rPr>
+          <w:sz w:val="18"/>
+          <w:szCs w:val="18"/>
           <w:rtl w:val="0"/>
         </w:rPr>
         <w:t xml:space="preserve">Refeicao(</w:t>
@@ -1811,7 +1673,6 @@
           <w:sz w:val="18"/>
           <w:szCs w:val="18"/>
           <w:u w:val="single"/>
-          <w:shd w:fill="6aa84f" w:val="clear"/>
           <w:rtl w:val="0"/>
         </w:rPr>
         <w:t xml:space="preserve">id_refeicao, #id_plano_alimentar,</w:t>
@@ -1820,7 +1681,6 @@
         <w:rPr>
           <w:sz w:val="18"/>
           <w:szCs w:val="18"/>
-          <w:shd w:fill="6aa84f" w:val="clear"/>
           <w:rtl w:val="0"/>
         </w:rPr>
         <w:t xml:space="preserve"> nome*, horario)</w:t>
@@ -1828,7 +1688,7 @@
     </w:p>
     <w:p>
       <w:pPr>
-        <w:shd w:fill="ececec" w:val="clear"/>
+        <w:shd w:fill="ffffff" w:val="clear"/>
         <w:rPr>
           <w:sz w:val="18"/>
           <w:szCs w:val="18"/>
@@ -1862,18 +1722,16 @@
     </w:p>
     <w:p>
       <w:pPr>
-        <w:shd w:fill="ececec" w:val="clear"/>
-        <w:rPr>
-          <w:sz w:val="18"/>
-          <w:szCs w:val="18"/>
-          <w:shd w:fill="6aa84f" w:val="clear"/>
-        </w:rPr>
-      </w:pPr>
-      <w:r>
-        <w:rPr>
-          <w:sz w:val="18"/>
-          <w:szCs w:val="18"/>
-          <w:shd w:fill="6aa84f" w:val="clear"/>
+        <w:shd w:fill="ffffff" w:val="clear"/>
+        <w:rPr>
+          <w:sz w:val="18"/>
+          <w:szCs w:val="18"/>
+        </w:rPr>
+      </w:pPr>
+      <w:r>
+        <w:rPr>
+          <w:sz w:val="18"/>
+          <w:szCs w:val="18"/>
           <w:rtl w:val="0"/>
         </w:rPr>
         <w:t xml:space="preserve">Refeicao_Contem_Alimento(</w:t>
@@ -1883,7 +1741,6 @@
           <w:sz w:val="18"/>
           <w:szCs w:val="18"/>
           <w:u w:val="single"/>
-          <w:shd w:fill="6aa84f" w:val="clear"/>
           <w:rtl w:val="0"/>
         </w:rPr>
         <w:t xml:space="preserve">#id_alimento, #id_plano_alimentar, #id_refeicao</w:t>
@@ -1892,7 +1749,6 @@
         <w:rPr>
           <w:sz w:val="18"/>
           <w:szCs w:val="18"/>
-          <w:shd w:fill="6aa84f" w:val="clear"/>
           <w:rtl w:val="0"/>
         </w:rPr>
         <w:t xml:space="preserve">, unidade_de_medida*, quantidade*, substituicao_permitida)</w:t>
@@ -1900,18 +1756,16 @@
     </w:p>
     <w:p>
       <w:pPr>
-        <w:shd w:fill="ececec" w:val="clear"/>
-        <w:rPr>
-          <w:sz w:val="18"/>
-          <w:szCs w:val="18"/>
-          <w:shd w:fill="6aa84f" w:val="clear"/>
-        </w:rPr>
-      </w:pPr>
-      <w:r>
-        <w:rPr>
-          <w:sz w:val="18"/>
-          <w:szCs w:val="18"/>
-          <w:shd w:fill="6aa84f" w:val="clear"/>
+        <w:shd w:fill="ffffff" w:val="clear"/>
+        <w:rPr>
+          <w:sz w:val="18"/>
+          <w:szCs w:val="18"/>
+        </w:rPr>
+      </w:pPr>
+      <w:r>
+        <w:rPr>
+          <w:sz w:val="18"/>
+          <w:szCs w:val="18"/>
           <w:rtl w:val="0"/>
         </w:rPr>
         <w:t xml:space="preserve">Observacao_Refeicao_Contem(</w:t>
@@ -1921,7 +1775,6 @@
           <w:sz w:val="18"/>
           <w:szCs w:val="18"/>
           <w:u w:val="single"/>
-          <w:shd w:fill="6aa84f" w:val="clear"/>
           <w:rtl w:val="0"/>
         </w:rPr>
         <w:t xml:space="preserve">id_obs_refeicao, #id_alimento, #id_plano_alimentar, #id_refeicao</w:t>
@@ -1930,7 +1783,6 @@
         <w:rPr>
           <w:sz w:val="18"/>
           <w:szCs w:val="18"/>
-          <w:shd w:fill="6aa84f" w:val="clear"/>
           <w:rtl w:val="0"/>
         </w:rPr>
         <w:t xml:space="preserve">, observacao*)</w:t>
@@ -1938,32 +1790,30 @@
     </w:p>
     <w:p>
       <w:pPr>
-        <w:shd w:fill="ececec" w:val="clear"/>
-        <w:rPr>
-          <w:sz w:val="18"/>
-          <w:szCs w:val="18"/>
-        </w:rPr>
-      </w:pPr>
-      <w:r>
-        <w:rPr>
-          <w:rtl w:val="0"/>
-        </w:rPr>
-      </w:r>
-    </w:p>
-    <w:p>
-      <w:pPr>
-        <w:shd w:fill="ececec" w:val="clear"/>
-        <w:rPr>
-          <w:sz w:val="18"/>
-          <w:szCs w:val="18"/>
-          <w:highlight w:val="yellow"/>
-        </w:rPr>
-      </w:pPr>
-      <w:r>
-        <w:rPr>
-          <w:sz w:val="18"/>
-          <w:szCs w:val="18"/>
-          <w:highlight w:val="yellow"/>
+        <w:shd w:fill="ffffff" w:val="clear"/>
+        <w:rPr>
+          <w:sz w:val="18"/>
+          <w:szCs w:val="18"/>
+        </w:rPr>
+      </w:pPr>
+      <w:r>
+        <w:rPr>
+          <w:rtl w:val="0"/>
+        </w:rPr>
+      </w:r>
+    </w:p>
+    <w:p>
+      <w:pPr>
+        <w:shd w:fill="ffffff" w:val="clear"/>
+        <w:rPr>
+          <w:sz w:val="18"/>
+          <w:szCs w:val="18"/>
+        </w:rPr>
+      </w:pPr>
+      <w:r>
+        <w:rPr>
+          <w:sz w:val="18"/>
+          <w:szCs w:val="18"/>
           <w:rtl w:val="0"/>
         </w:rPr>
         <w:t xml:space="preserve">Historico_Plano_Treino(</w:t>
@@ -1972,7 +1822,6 @@
         <w:rPr>
           <w:sz w:val="18"/>
           <w:szCs w:val="18"/>
-          <w:highlight w:val="yellow"/>
           <w:u w:val="single"/>
           <w:rtl w:val="0"/>
         </w:rPr>
@@ -1982,7 +1831,6 @@
         <w:rPr>
           <w:sz w:val="18"/>
           <w:szCs w:val="18"/>
-          <w:highlight w:val="yellow"/>
           <w:rtl w:val="0"/>
         </w:rPr>
         <w:t xml:space="preserve">, data_alteracao*, descricao_alteracao*, #id_profissional*)</w:t>
@@ -1990,18 +1838,13 @@
     </w:p>
     <w:p>
       <w:pPr>
-        <w:shd w:fill="ececec" w:val="clear"/>
-        <w:rPr>
-          <w:sz w:val="18"/>
-          <w:szCs w:val="18"/>
-          <w:highlight w:val="yellow"/>
-        </w:rPr>
-      </w:pPr>
-      <w:r>
-        <w:rPr>
-          <w:sz w:val="18"/>
-          <w:szCs w:val="18"/>
-          <w:highlight w:val="yellow"/>
+        <w:shd w:fill="ffffff" w:val="clear"/>
+        <w:rPr/>
+      </w:pPr>
+      <w:r>
+        <w:rPr>
+          <w:sz w:val="18"/>
+          <w:szCs w:val="18"/>
           <w:rtl w:val="0"/>
         </w:rPr>
         <w:t xml:space="preserve">Historico_Plano_Alimentar(</w:t>
@@ -2010,7 +1853,6 @@
         <w:rPr>
           <w:sz w:val="18"/>
           <w:szCs w:val="18"/>
-          <w:highlight w:val="yellow"/>
           <w:u w:val="single"/>
           <w:rtl w:val="0"/>
         </w:rPr>
@@ -2020,16 +1862,10 @@
         <w:rPr>
           <w:sz w:val="18"/>
           <w:szCs w:val="18"/>
-          <w:highlight w:val="yellow"/>
           <w:rtl w:val="0"/>
         </w:rPr>
         <w:t xml:space="preserve">, data_alteracao*, descricao_alteracao*, #id_profissional*)</w:t>
       </w:r>
-    </w:p>
-    <w:p>
-      <w:pPr>
-        <w:rPr/>
-      </w:pPr>
       <w:r>
         <w:rPr>
           <w:rtl w:val="0"/>

</xml_diff>